<commit_message>
docs: correct overstatements in the drafts found by checking them against the code
Every executable claim in the SoftwareX draft reproduces at HEAD (9 checks,
+1 with a counter; 9 materials; the DBS example 10.94-16.41 mA, Shannon 7.64x,
CAUTION, provisional; the ring's 40 uA; the monophasic refusal). Corrected:
- "every number traceable to a page of a paper" -> every constant traceable to
  its source, with the gaps listed (three values have none; some are
  second-hand);
- "primary source" -> "source" for the same reason;
- "large contacts are usually limited by the tissue" removed: the paper's own
  DBS example is limited by charge injection;
- Kuncel & Grill cited as a DBS reference density, not an electroporation
  threshold;
- the reviews were AI-assisted, not "independent";
- branch-point coverage is now 85.8 % (587/684), not 84.8 %.

Co-Authored-By: Claude Opus 5.5 <noreply@anthropic.com>
</commit_message>
<xml_diff>
--- a/softwarex/manuscript_draft.docx
+++ b/softwarex/manuscript_draft.docx
@@ -50,7 +50,7 @@
         <w:t>neurostim-safety</w:t>
       </w:r>
       <w:r>
-        <w:t xml:space="preserve"> is an open-source Python package that assesses whether a neural-stimulation protocol is safe for the tissue and for the electrode that delivers it. From an electrode's geometry and material and a protocol's current, pulse width, rate, train and charge recovery, it evaluates nine established tissue-damage, electrochemical and instrument limits and reports the highest current at which none of them fails, or refuses to report one when no current is safe. Every constant carries its primary source and the conditions it was measured under, and those conditions travel into every report, flagging a limit applied outside them as provisional. Text, PDF, JSON, CSV, figure and desktop outputs are provided.</w:t>
+        <w:t xml:space="preserve"> is an open-source Python package that assesses whether a neural-stimulation protocol is safe for the tissue and for the electrode that delivers it. From an electrode's geometry and material and a protocol's current, pulse width, rate, train and charge recovery, it evaluates nine established tissue-damage, electrochemical and instrument limits and reports the highest current at which none of them fails, or refuses to report one when no current is safe. Every constant carries its source and the conditions it was measured under, and those conditions travel into every report, flagging a limit applied outside them as provisional. Text, PDF, JSON, CSV, figure and desktop outputs are provided.</w:t>
       </w:r>
     </w:p>
     <w:p>
@@ -831,7 +831,7 @@
     <w:p>
       <w:pPr/>
       <w:r>
-        <w:t>Electrical stimulation of the nervous system — deep brain stimulation, cortical and spinal microstimulation, cochlear and retinal prostheses — is bounded by two families of limits. Tissue limits describe the charge that damages neurons, most prominently the Shannon criterion fitted to McCreery's cat-cortex data [1, 2]. Electrode limits describe the charge an electrode can inject reversibly before irreversible Faradaic reactions, gas evolution or dissolution begin [3, 4]. Which family binds depends on electrode size [5]: large clinical contacts are usually limited by the tissue, microelectrodes by the electrode or by a charge-per-phase threshold that the Shannon criterion does not capture.</w:t>
+        <w:t>Electrical stimulation of the nervous system — deep brain stimulation, cortical and spinal microstimulation, cochlear and retinal prostheses — is bounded by two families of limits. Tissue limits describe the charge that damages neurons, most prominently the Shannon criterion fitted to McCreery's cat-cortex data [1, 2]. Electrode limits describe the charge an electrode can inject reversibly before irreversible Faradaic reactions, gas evolution or dissolution begin [3, 4]. Which family binds depends on electrode size [5]: large and small electrodes can be limited by different mechanisms, and microelectrodes by a charge-per-phase threshold that the Shannon criterion does not capture.</w:t>
       </w:r>
     </w:p>
     <w:p>
@@ -856,7 +856,7 @@
         <w:t>neurostim-safety</w:t>
       </w:r>
       <w:r>
-        <w:t xml:space="preserve"> performs this calculation once, reproducibly, with every number traceable to a page of a paper. A user describes the electrode and the protocol; the package evaluates every applicable limit, reports which one binds and at what current, and states explicitly when a limit is applied outside the conditions it was measured under. The intended users are experimenters designing stimulation protocols, engineers choosing electrode materials and sizes, and reviewers checking the safety argument of a methods section.</w:t>
+        <w:t xml:space="preserve"> performs this calculation once, reproducibly, with every constant traceable to its source; the few values without a primary source are listed openly. A user describes the electrode and the protocol; the package evaluates every applicable limit, reports which one binds and at what current, and states explicitly when a limit is applied outside the conditions it was measured under. The intended users are experimenters designing stimulation protocols, engineers choosing electrode materials and sizes, and reviewers checking the safety argument of a methods section.</w:t>
       </w:r>
     </w:p>
     <w:p>
@@ -914,7 +914,7 @@
         <w:t>Safety core.</w:t>
       </w:r>
       <w:r>
-        <w:t xml:space="preserve"> Nine checks are evaluated for every assessment: the Shannon criterion [1]; the material charge-injection limit [3, 4]; the water window, including the DC drift of an incompletely recovered train; the validated envelope of the data behind the Shannon fit; current density against an electroporation threshold [8, 9]; the microelectrode charge-per-phase threshold [5]; chronic degradation; charge balance [10]; and the stimulator's compliance voltage, optionally with a counter electrode, which adds a tenth check on the counter's own charge injection. Each check returns a status, the current at which it would fail, the published range of that ceiling, and whether it rests on an unconfirmed constant or model.</w:t>
+        <w:t xml:space="preserve"> Nine checks are evaluated for every assessment: the Shannon criterion [1]; the material charge-injection limit [3, 4]; the water window, including the DC drift of an incompletely recovered train; the validated envelope of the data behind the Shannon fit; current density against an electroporation threshold [8], with a clinical DBS reference density from [9]; the microelectrode charge-per-phase threshold [5]; chronic degradation; charge balance [10]; and the stimulator's compliance voltage, optionally with a counter electrode, which adds a tenth check on the counter's own charge injection. Each check returns a status, the current at which it would fail, the published range of that ceiling, and whether it rests on an unconfirmed constant or model.</w:t>
       </w:r>
     </w:p>
     <w:p>
@@ -1340,7 +1340,7 @@
         <w:t>Correctness and verification</w:t>
       </w:r>
       <w:r>
-        <w:t>: the package was audited before release, and the full record of findings, fixes and independent reviews is in the repository. The test suite (≈1,700 tests) checks constants against their sources, reproduces published results from published inputs (for example, the Pennes model gives a 0.83 K peak rise for the drive of Elwassif et al. [11] against their finite-element 0.82 K), checks the headline limit against an independent search, and is gated in continuous integration on branch coverage (84.8 %) and mutation testing (85.6 % of pre-registered generated mutants killed).</w:t>
+        <w:t>: the package was audited before release, and the full record of findings, fixes and AI-assisted review passes is in the repository. The test suite (≈1,700 tests) checks constants against their sources, reproduces published results from published inputs (for example, the Pennes model gives a 0.83 K peak rise for the drive of Elwassif et al. [11] against their finite-element 0.82 K), checks the headline limit against an independent search, and is gated in continuous integration on branch coverage (85.8 %) and mutation testing (85.6 % of pre-registered generated mutants killed).</w:t>
       </w:r>
     </w:p>
     <w:p>
@@ -1444,7 +1444,7 @@
         <w:t>[AUTHOR: must be truthful and specific. Suggested wording, edit to match what you did:]</w:t>
       </w:r>
       <w:r>
-        <w:t xml:space="preserve"> During the preparation of this work the author used Claude (Anthropic; Claude Opus 5 and Opus 5.5, via Claude Code) to audit and repair the software, to write most of its test suite and continuous-integration configuration, to review each change independently, and to produce an initial draft of this manuscript and its figures. The author substantially rewrote the manuscript, made the modelling and source decisions recorded in the repository, and reviewed and validated the code and text. After using this tool, the author reviewed and edited the content as needed and takes full responsibility for the content of the publication.</w:t>
+        <w:t xml:space="preserve"> During the preparation of this work the author used Claude (Anthropic; Claude Opus 5 and Opus 5.5, via Claude Code) to audit and repair the software, to write most of its test suite and continuous-integration configuration, to review each change in separate AI review sessions, and to produce an initial draft of this manuscript and its figures. The author substantially rewrote the manuscript, made the modelling and source decisions recorded in the repository, and reviewed and validated the code and text. After using this tool, the author reviewed and edited the content as needed and takes full responsibility for the content of the publication.</w:t>
       </w:r>
     </w:p>
     <w:p>

</xml_diff>

<commit_message>
docs(softwarex): related work checked against the tools' own publications
Replaces the unverified related-work note. Checked sources: Lead-DBS (Horn &
Kuhn 2015; Neudorfer et al. 2023), OSS-DBS (Butenko et al. 2020) and FastField
(Baniasadi et al. 2020) describe localization, fields and activated volumes,
with no charge-density, charge-injection or tissue-damage limits in their
abstracts (OSS-DBS full text searched). Correction: Sim4Life does assess
safety, including tissue heating and the Shannon criterion (vendor
application note), so the draft no longer claims otherwise. Adds the closest
prior work, Vatsyayan & Dayeh 2022 (a model of in-vivo electrochemical limits,
no released code), and Cisnal et al. 2018 (automated CIC measurement).
Citations [13]-[19] verified against Crossref.

Co-Authored-By: Claude Opus 5.5 <noreply@anthropic.com>
</commit_message>
<xml_diff>
--- a/softwarex/manuscript_draft.docx
+++ b/softwarex/manuscript_draft.docx
@@ -862,13 +862,23 @@
     <w:p>
       <w:pPr/>
       <w:r>
-        <w:t xml:space="preserve">Related work. </w:t>
+        <w:t xml:space="preserve">Related work. Open-source DBS tools model where current goes rather than whether it is safe: Lead-DBS localizes and reconstructs implanted electrodes and models stimulation volumes [13, 14], OSS-DBS computes electric fields and neural activation with automated volume-conductor models [15], and FastField approximates DBS fields and volumes of tissue activated quickly by superposition [16]; none of their primary publications describes charge-density, charge-injection or tissue-damage limits. The commercial platform Sim4Life does assess neurostimulation safety, for example tissue heating and the Shannon criterion in a vagus-nerve stimulator design study [17], and general finite-element environments such as COMSOL can be used to compute fields and heating, but neither is an open, source-traced implementation of the limits themselves. Closest in aim, Vatsyayan and Dayeh [18] developed a model predicting electrochemical safety limits in vivo from electrode geometry, separation, material and stimulation paradigm; it is published as a model, not as reusable software. Cisnal et al. [19] automate the measurement of an electrode's charge-injection capacity, a value that </w:t>
+      </w:r>
+      <w:r>
+        <w:rPr>
+          <w:rFonts w:ascii="Courier New" w:hAnsi="Courier New"/>
+          <w:sz w:val="18"/>
+        </w:rPr>
+        <w:t>neurostim-safety</w:t>
+      </w:r>
+      <w:r>
+        <w:t xml:space="preserve"> can take as a user-measured input. </w:t>
       </w:r>
       <w:r>
         <w:rPr>
           <w:highlight w:val="yellow"/>
         </w:rPr>
-        <w:t>[AUTHOR: verify and complete. Suggested starting points: finite-element environments (COMSOL, Sim4Life) model fields and heating but do not encode the literature's damage and charge-injection limits; DBS toolboxes such as Lead-DBS and OSS-DBS estimate volumes of tissue activated rather than safety limits; published calculators and spreadsheets typically quote one limit per material without its measurement conditions. State what, to your knowledge, does not exist.]</w:t>
+        <w:t>[AUTHOR: check each characterisation against the cited papers and add any tool you know of.]</w:t>
       </w:r>
     </w:p>
     <w:p>
@@ -1470,10 +1480,28 @@
     <w:p>
       <w:pPr/>
       <w:r>
+        <w:t xml:space="preserve">[13] A. Horn, A.A. Kühn, Lead-DBS: a toolbox for deep brain stimulation electrode localizations and visualizations, NeuroImage 107 (2015) 127–135. https://doi.org/10.1016/j.neuroimage.2014.12.002 [14] C. Neudorfer, K. Butenko, S. Oxenford, N. Rajamani, J. Achtzehn, L. Goede, et al., Lead-DBS v3.0: mapping deep brain stimulation effects to local anatomy and global networks, NeuroImage 268 (2023) 119862. https://doi.org/10.1016/j.neuroimage.2023.119862 [15] K. Butenko, C. Bahls, M. Schröder, R. Köhling, U. van Rienen, OSS-DBS: open-source simulation platform for deep brain stimulation with a comprehensive automated modeling, PLoS Comput. Biol. 16 (2020) e1008023. https://doi.org/10.1371/journal.pcbi.1008023 [16] M. Baniasadi, D. Proverbio, J. Gonçalves, F. Hertel, A. Husch, FastField: an open-source toolbox for efficient approximation of deep brain stimulation electric fields, NeuroImage 223 (2020) 117330. https://doi.org/10.1016/j.neuroimage.2020.117330 [17] ZMT Zurich MedTech / IT'IS Foundation, In silico vagus nerve stimulator: design, optimization, and safety evidence generation (Sim4Life application note). https://sim4life.swiss/in-silico-vagus-nerve-stimulator-design-optimization </w:t>
+      </w:r>
+      <w:r>
         <w:rPr>
           <w:highlight w:val="yellow"/>
         </w:rPr>
-        <w:t>[AUTHOR: every reference above was taken from the package's paper.bib; check author lists, volumes and pages against each paper before submitting.]</w:t>
+        <w:t>[AUTHOR: prefer a peer-reviewed Sim4Life publication if you can find one]</w:t>
+      </w:r>
+      <w:r>
+        <w:t xml:space="preserve"> [18] R. Vatsyayan, S.A. Dayeh, A universal model of electrochemical safety limits in vivo for electrophysiological stimulation, Front. Neurosci. 16 (2022) 972252. https://doi.org/10.3389/fnins.2022.972252 [19] A. Cisnal, J.-C. Fraile, J. Pérez-Turiel, V. Muñoz-Martinez, C. Müller, F.R. Ihmig, A measurement setup and automated calculation method to determine the charge injection capacity of implantable microelectrodes, Sensors 18 (2018) 4152. https://doi.org/10.3390/s18124152</w:t>
+      </w:r>
+    </w:p>
+    <w:p>
+      <w:pPr/>
+      <w:r>
+        <w:rPr>
+          <w:highlight w:val="yellow"/>
+        </w:rPr>
+        <w:t>[AUTHOR: references [1]</w:t>
+      </w:r>
+      <w:r>
+        <w:t>-[11] are from the package's paper.bib and [13]-[19] were checked against Crossref and the papers' abstracts; check author lists, volumes and pages against each paper before submitting.]</w:t>
       </w:r>
     </w:p>
     <w:sectPr>

</xml_diff>